<commit_message>
Actualiza datos y modelo financiero por decisiones del director
- Nombres: Guido Maldonado (era Mardonado), Fabelly Maciel Fabian Bello (era Fabelle).
- La Vega: Leticia González confirmada (1 asesor). SD: Marleny + Sandrita confirmados.
- Modelo financiero (estado.json + build_finanzas/docx/drive):
  - Piso: completar 100 personas en la casa (≈47 operativos + ~53 participantes).
  - Meta de recaudación = COSTO TOTAL (≈$533,481), no un número fijo inventado.
    Se cubre con cuotas (participantes $3,000 + equipo $1,500–2,000) + rifa/venta de
    comida + donaciones (montos VARIABLES, lo que se recaude).
  - Quitadas las cifras inventadas (meta $260K, rifa $130K, profondo2/donaciones $50K).
    La brecha ($292,231) se calcula = costo − cuotas y la cubre la recaudación variable.
- verify.py: meta ya no exige [PROPUESTA]; blinda contra el viejo $260K.
- Guión 4-jun y banderas actualizados. TODO PASS.

https://claude.ai/code/session_016scja59CycFFrqKgYsUPWh
</commit_message>
<xml_diff>
--- a/Documento_Asesores_ETC88.docx
+++ b/Documento_Asesores_ETC88.docx
@@ -544,7 +544,7 @@
         <w:rPr>
           <w:b/>
         </w:rPr>
-        <w:t>Fabelle maciel fabian bello</w:t>
+        <w:t>Fabelly Maciel Fabian Bello</w:t>
       </w:r>
       <w:r>
         <w:t xml:space="preserve"> · Cocina</w:t>
@@ -558,7 +558,7 @@
         <w:rPr>
           <w:b/>
         </w:rPr>
-        <w:t>Guido Mardonado</w:t>
+        <w:t>Guido Maldonado</w:t>
       </w:r>
       <w:r>
         <w:t xml:space="preserve"> · Cocina</w:t>
@@ -1364,13 +1364,13 @@
         <w:t xml:space="preserve">Meta de recaudación: </w:t>
       </w:r>
       <w:r>
-        <w:t>[PROPUESTA] RD$260,000</w:t>
+        <w:t>RD$533,481</w:t>
       </w:r>
       <w:r>
         <w:rPr>
           <w:i/>
         </w:rPr>
-        <w:t xml:space="preserve"> — El director pidió una 'meta más agresiva' sin fijar monto. Esta cifra es propuesta a validar.</w:t>
+        <w:t xml:space="preserve"> — No es un número fijo: = costo total estimado a cubrir (casa 100 personas + costos del retiro + deuda $23,600). Se cubre con cuotas de participantes ($3,000) + cuotas del equipo ($1,500–2,000) + rifa y/o venta de comida + donaciones. Se recalcula con el presupuesto (hoja Finanzas).</w:t>
       </w:r>
     </w:p>
     <w:p>
@@ -1381,16 +1381,36 @@
         <w:rPr>
           <w:b/>
         </w:rPr>
-        <w:t xml:space="preserve">Participantes (estimado): </w:t>
+        <w:t xml:space="preserve">Personas en la casa (piso): </w:t>
       </w:r>
       <w:r>
-        <w:t>[POR DEFINIR] 48</w:t>
+        <w:t>100</w:t>
       </w:r>
       <w:r>
         <w:rPr>
           <w:i/>
         </w:rPr>
-        <w:t xml:space="preserve"> — Falta confirmar el número final de participantes; afecta casa, peces, biblias y comida.</w:t>
+        <w:t xml:space="preserve"> — Piso fijado: completar 100 personas en la casa de retiro.</w:t>
+      </w:r>
+    </w:p>
+    <w:p>
+      <w:pPr>
+        <w:pStyle w:val="ListBullet"/>
+      </w:pPr>
+      <w:r>
+        <w:rPr>
+          <w:b/>
+        </w:rPr>
+        <w:t xml:space="preserve">Participantes (objetivo): </w:t>
+      </w:r>
+      <w:r>
+        <w:t>[PROPUESTA] 53</w:t>
+      </w:r>
+      <w:r>
+        <w:rPr>
+          <w:i/>
+        </w:rPr>
+        <w:t xml:space="preserve"> — Los que falten para completar 100 en la casa junto al equipo. Ajustar con el conteo final.</w:t>
       </w:r>
     </w:p>
     <w:p>
@@ -1409,16 +1429,16 @@
         <w:rPr>
           <w:b/>
         </w:rPr>
-        <w:t xml:space="preserve">Rifa (Profondo #1, neta): </w:t>
+        <w:t xml:space="preserve">Modelo: </w:t>
       </w:r>
       <w:r>
-        <w:t>[PROPUESTA] RD$130,000</w:t>
+        <w:t>cuotas + rifa y/o venta de comida + donaciones</w:t>
       </w:r>
       <w:r>
         <w:rPr>
           <w:i/>
         </w:rPr>
-        <w:t xml:space="preserve"> — Meta neta de la rifa a validar.</w:t>
+        <w:t xml:space="preserve"> — La meta = el costo total del retiro. Se cubre con: cuotas de participantes ($3,000 c/u) + cuotas del equipo ($1,500–2,000 c/u) + rifa y/o venta de comida + donaciones. La rifa, la venta de comida y las donaciones cubren la BRECHA = costo − cuotas; sus montos son variables (lo que se recaude).</w:t>
       </w:r>
     </w:p>
     <w:p>
@@ -1426,19 +1446,7 @@
         <w:pStyle w:val="ListBullet"/>
       </w:pPr>
       <w:r>
-        <w:rPr>
-          <w:b/>
-        </w:rPr>
-        <w:t xml:space="preserve">Profondo #2 (comida / garaje): </w:t>
-      </w:r>
-      <w:r>
-        <w:t>[PROPUESTA] RD$50,000</w:t>
-      </w:r>
-      <w:r>
-        <w:rPr>
-          <w:i/>
-        </w:rPr>
-        <w:t xml:space="preserve"> — Benchmark ETC 79 ≈ $50K (venta de comida / garaje).</w:t>
+        <w:t>Rifa, venta de comida y donaciones: montos variables (lo que se recaude); cubren la brecha = costo − cuotas.</w:t>
       </w:r>
     </w:p>
     <w:p>
@@ -1446,27 +1454,7 @@
         <w:pStyle w:val="ListBullet"/>
       </w:pPr>
       <w:r>
-        <w:rPr>
-          <w:b/>
-        </w:rPr>
-        <w:t xml:space="preserve">Donaciones empresas/particulares: </w:t>
-      </w:r>
-      <w:r>
-        <w:t>[PROPUESTA] RD$50,000</w:t>
-      </w:r>
-      <w:r>
-        <w:rPr>
-          <w:i/>
-        </w:rPr>
-        <w:t xml:space="preserve"> — Conseguir donaciones a empresas/particulares es responsabilidad de los Directores (delegable).</w:t>
-      </w:r>
-    </w:p>
-    <w:p>
-      <w:pPr>
-        <w:pStyle w:val="ListBullet"/>
-      </w:pPr>
-      <w:r>
-        <w:t>La primera actividad es una rifa (confirmado, por recomendación del equipo).</w:t>
+        <w:t>La primera actividad es una rifa (confirmado). Las donaciones a empresas/particulares son responsabilidad de los Directores (delegable).</w:t>
       </w:r>
     </w:p>
     <w:p>
@@ -1687,6 +1675,46 @@
     </w:p>
     <w:p>
       <w:pPr>
+        <w:pStyle w:val="ListBullet"/>
+      </w:pPr>
+      <w:r>
+        <w:t>Piso de personas: completar 100 en la casa de retiro.</w:t>
+      </w:r>
+    </w:p>
+    <w:p>
+      <w:pPr>
+        <w:pStyle w:val="ListBullet"/>
+      </w:pPr>
+      <w:r>
+        <w:t>La meta de recaudación = el costo total del retiro (se cubre con cuotas + rifa/venta de comida + donaciones).</w:t>
+      </w:r>
+    </w:p>
+    <w:p>
+      <w:pPr>
+        <w:pStyle w:val="ListBullet"/>
+      </w:pPr>
+      <w:r>
+        <w:t>Santo Domingo: 2 asesores de comunidad, Marleny y Sandrita.</w:t>
+      </w:r>
+    </w:p>
+    <w:p>
+      <w:pPr>
+        <w:pStyle w:val="ListBullet"/>
+      </w:pPr>
+      <w:r>
+        <w:t>La Vega: 1 asesor de comunidad, Leticia González.</w:t>
+      </w:r>
+    </w:p>
+    <w:p>
+      <w:pPr>
+        <w:pStyle w:val="ListBullet"/>
+      </w:pPr>
+      <w:r>
+        <w:t>Nombres corregidos: Guido Maldonado · Fabelly Maciel Fabian Bello.</w:t>
+      </w:r>
+    </w:p>
+    <w:p>
+      <w:pPr>
         <w:pStyle w:val="Heading1"/>
       </w:pPr>
       <w:r>
@@ -1706,7 +1734,7 @@
         <w:pStyle w:val="ListBullet"/>
       </w:pPr>
       <w:r>
-        <w:t>[POR DEFINIR] Confirmar el número final de participantes.</w:t>
+        <w:t>[POR DEFINIR] Confirmar el conteo final de participantes para completar 100 en la casa.</w:t>
       </w:r>
     </w:p>
     <w:p>
@@ -1715,14 +1743,6 @@
       </w:pPr>
       <w:r>
         <w:t>[POR DEFINIR] Completar la vacante de cocina (varón — candidato Randolph).</w:t>
-      </w:r>
-    </w:p>
-    <w:p>
-      <w:pPr>
-        <w:pStyle w:val="ListBullet"/>
-      </w:pPr>
-      <w:r>
-        <w:t>[POR DEFINIR] Definir si van 1 o 2 representantes de La Vega.</w:t>
       </w:r>
     </w:p>
     <w:p>

</xml_diff>

<commit_message>
Presupuesto: camisetas del equipo + costo de la avanzada del jueves + pestaña de tallas
- Camisetas del equipo (~56 × est.) y Avanzada 3-sep (porción casa + 3 comidas) agregadas
  al Resumen. Meta (= costo) recalculada a ~$575,881; brecha a cubrir con recaudación
  variable = $334,631.
- Pestaña Camisetas: distribución de tallas recopiladas + a quién le falta (Paul, Frank,
  Sor, ampliados, sin-formulario). Backups excluidos (no son equipo per se).
- estado.json pendientes: flujo de caja (sesión aparte), tarifa de la avanzada, tallas.
- preparacion/MODELO_FLUJO_CAJA.md: encuadre de la sesión de tesorería (no construido aún).

https://claude.ai/code/session_016scja59CycFFrqKgYsUPWh
</commit_message>
<xml_diff>
--- a/Documento_Asesores_ETC88.docx
+++ b/Documento_Asesores_ETC88.docx
@@ -1364,13 +1364,13 @@
         <w:t xml:space="preserve">Meta de recaudación: </w:t>
       </w:r>
       <w:r>
-        <w:t>RD$533,481</w:t>
+        <w:t>RD$575,881</w:t>
       </w:r>
       <w:r>
         <w:rPr>
           <w:i/>
         </w:rPr>
-        <w:t xml:space="preserve"> — No es un número fijo: = costo total estimado a cubrir (casa 100 personas + costos del retiro + deuda $23,600). Se cubre con cuotas de participantes ($3,000) + cuotas del equipo ($1,500–2,000) + rifa y/o venta de comida + donaciones. Se recalcula con el presupuesto (hoja Finanzas).</w:t>
+        <w:t xml:space="preserve"> — No es un número fijo: = costo total estimado a cubrir (casa 100 personas + costos del retiro + camisetas + avanzada del jueves + deuda $23,600). Se cubre con cuotas de participantes ($3,000) + cuotas del equipo ($1,500–2,000) + rifa y/o venta de comida + donaciones. Se recalcula con el presupuesto (hoja Finanzas).</w:t>
       </w:r>
     </w:p>
     <w:p>
@@ -1783,6 +1783,30 @@
       </w:pPr>
       <w:r>
         <w:t>[POR DEFINIR] Cotizar transporte (3 empresas) y el banderín.</w:t>
+      </w:r>
+    </w:p>
+    <w:p>
+      <w:pPr>
+        <w:pStyle w:val="ListBullet"/>
+      </w:pPr>
+      <w:r>
+        <w:t>[POR DEFINIR] Modelo de flujo de caja: asignar cada entrada a un compromiso e ir costeando con el calendario de pagos (sesión aparte).</w:t>
+      </w:r>
+    </w:p>
+    <w:p>
+      <w:pPr>
+        <w:pStyle w:val="ListBullet"/>
+      </w:pPr>
+      <w:r>
+        <w:t>[POR DEFINIR] Confirmar con la casa la tarifa de la avanzada (noche/día extra del equipo que adelanta el jueves) + sus 3 comidas.</w:t>
+      </w:r>
+    </w:p>
+    <w:p>
+      <w:pPr>
+        <w:pStyle w:val="ListBullet"/>
+      </w:pPr>
+      <w:r>
+        <w:t>[POR DEFINIR] Completar las tallas de camiseta que faltan (invitados pendientes + Paul, Frank y la Sor); el mockup va tras el Design System.</w:t>
       </w:r>
     </w:p>
     <w:p>

</xml_diff>

<commit_message>
Petra (no Peta) + convivencia/ensayo-con-almuerzo/bizcocho post-ETC al presupuesto
- Corrección de nombre: Mary "Petra" Morales (era "Peta") en fuentes y docs.
- Resumen + pestaña Formaciones: agregadas Convivencia (22-ago, ~12K), Ensayo General
  con almuerzo del equipo (23-ago, ~16K) y Bienvenida post-ETC / bizcocho (9-sep, ~3K).
  Estaban en el detalle pero no en el total.
- Meta (= costo) recalculada a ~$606,881; brecha a cubrir con recaudación variable = $365,631.
- TODO PASS.

https://claude.ai/code/session_016scja59CycFFrqKgYsUPWh
</commit_message>
<xml_diff>
--- a/Documento_Asesores_ETC88.docx
+++ b/Documento_Asesores_ETC88.docx
@@ -825,7 +825,7 @@
         <w:pStyle w:val="ListBullet"/>
       </w:pPr>
       <w:r>
-        <w:t>Asesoras de cocina: Johanny García · Mary "Peta" Morales</w:t>
+        <w:t>Asesoras de cocina: Johanny García · Mary "Petra" Morales</w:t>
       </w:r>
     </w:p>
     <w:p>
@@ -1364,13 +1364,13 @@
         <w:t xml:space="preserve">Meta de recaudación: </w:t>
       </w:r>
       <w:r>
-        <w:t>RD$575,881</w:t>
+        <w:t>RD$606,881</w:t>
       </w:r>
       <w:r>
         <w:rPr>
           <w:i/>
         </w:rPr>
-        <w:t xml:space="preserve"> — No es un número fijo: = costo total estimado a cubrir (casa 100 personas + costos del retiro + camisetas + avanzada del jueves + deuda $23,600). Se cubre con cuotas de participantes ($3,000) + cuotas del equipo ($1,500–2,000) + rifa y/o venta de comida + donaciones. Se recalcula con el presupuesto (hoja Finanzas).</w:t>
+        <w:t xml:space="preserve"> — No es un número fijo: = costo total estimado a cubrir (casa 100 personas + costos del retiro + camisetas + avanzada del jueves + convivencia + ensayo con almuerzo + bizcocho post-ETC + deuda $23,600). Se cubre con cuotas de participantes ($3,000) + cuotas del equipo ($1,500–2,000) + rifa y/o venta de comida + donaciones. Se recalcula con el presupuesto (hoja Finanzas).</w:t>
       </w:r>
     </w:p>
     <w:p>
@@ -1654,7 +1654,7 @@
         <w:pStyle w:val="ListBullet"/>
       </w:pPr>
       <w:r>
-        <w:t>Asesoras de cocina: Mary "Peta" Morales y Johanny García.</w:t>
+        <w:t>Asesoras de cocina: Mary "Petra" Morales y Johanny García.</w:t>
       </w:r>
     </w:p>
     <w:p>

</xml_diff>

<commit_message>
Coherencia Carpeta: calendario reunión = jueves 4-jun (sin opción 7-jun) + bienvenida 9-sep
Cruce pieza por pieza de la Carpeta (Guía + Guía de Guías + Anexo Cocina) contra roster,
horario y salud:
- Nombres: ninguno inventado (cruce automático + manual); todos en el roster con su área.
- Alergias/condiciones del Anexo cuadran con data.salud. Secuencia de PGs cuadra con el horario.
- FIX: el calendario ofrecía 'jue 4-jun o dom 7-jun'; ya está confirmado jueves 4-jun virtual.
- Agregada al calendario la Bienvenida post-ETC (9-sep), que ya estaba en el presupuesto.
TODO PASS.

https://claude.ai/code/session_016scja59CycFFrqKgYsUPWh
</commit_message>
<xml_diff>
--- a/Documento_Asesores_ETC88.docx
+++ b/Documento_Asesores_ETC88.docx
@@ -921,7 +921,7 @@
           </w:tcPr>
           <w:p>
             <w:r>
-              <w:t>Reunión de Coordinadores — jue 4-jun (Corpus Christi, virtual) o dom 7-jun (pre-misa)</w:t>
+              <w:t>Reunión de Coordinadores (jueves 4-jun · Corpus Christi · virtual)</w:t>
             </w:r>
           </w:p>
         </w:tc>
@@ -1256,6 +1256,28 @@
           </w:p>
         </w:tc>
       </w:tr>
+      <w:tr>
+        <w:tc>
+          <w:tcPr>
+            <w:tcW w:type="dxa" w:w="4320"/>
+          </w:tcPr>
+          <w:p>
+            <w:r>
+              <w:t>9-sep</w:t>
+            </w:r>
+          </w:p>
+        </w:tc>
+        <w:tc>
+          <w:tcPr>
+            <w:tcW w:type="dxa" w:w="4320"/>
+          </w:tcPr>
+          <w:p>
+            <w:r>
+              <w:t>Bienvenida post-ETC a los nuevos (baile + bizcocho) (sin formación)</w:t>
+            </w:r>
+          </w:p>
+        </w:tc>
+      </w:tr>
     </w:tbl>
     <w:p>
       <w:pPr>

</xml_diff>